<commit_message>
Termination letter (69 Taman Intan): remove witness block
Co-Authored-By: Claude Opus 4.8 <noreply@anthropic.com>
Claude-Session: https://claude.ai/code/session_01WYLXC9uaFEEBGfEAmw5PKy
</commit_message>
<xml_diff>
--- a/Termination_Tenancy_69TamanIntan_Klang.docx
+++ b/Termination_Tenancy_69TamanIntan_Klang.docx
@@ -177,23 +177,6 @@
         </w:tc>
       </w:tr>
     </w:tbl>
-    <w:p/>
-    <w:p>
-      <w:r>
-        <w:t>Witness by:</w:t>
-      </w:r>
-    </w:p>
-    <w:p/>
-    <w:p>
-      <w:r>
-        <w:t>_____________________________</w:t>
-      </w:r>
-    </w:p>
-    <w:p>
-      <w:r>
-        <w:t>Name: ______________________</w:t>
-      </w:r>
-    </w:p>
     <w:sectPr>
       <w:pgSz w:w="12240" w:h="15840"/>
       <w:pgMar w:top="1440" w:right="1800" w:bottom="1440" w:left="1800" w:header="720" w:footer="720" w:gutter="0"/>

</xml_diff>